<commit_message>
Update file Word lan 2
</commit_message>
<xml_diff>
--- a/Phieu hoc tap/PhieuhoctapCSS-BTTH02-K66.docx
+++ b/Phieu hoc tap/PhieuhoctapCSS-BTTH02-K66.docx
@@ -6425,10 +6425,10 @@
           <w:noProof/>
         </w:rPr>
         <w:drawing>
-          <wp:inline distT="0" distB="0" distL="0" distR="0" wp14:anchorId="56414A58" wp14:editId="4FEF1457">
+          <wp:inline distT="0" distB="0" distL="0" distR="0" wp14:anchorId="2CCBFFC0" wp14:editId="7DF67114">
             <wp:extent cx="6038850" cy="3397250"/>
             <wp:effectExtent l="0" t="0" r="0" b="0"/>
-            <wp:docPr id="10" name="Picture 10"/>
+            <wp:docPr id="6" name="Picture 6"/>
             <wp:cNvGraphicFramePr>
               <a:graphicFrameLocks xmlns:a="http://schemas.openxmlformats.org/drawingml/2006/main" noChangeAspect="1"/>
             </wp:cNvGraphicFramePr>
@@ -6460,6 +6460,11 @@
           </wp:inline>
         </w:drawing>
       </w:r>
+    </w:p>
+    <w:p>
+      <w:pPr>
+        <w:spacing w:after="210" w:line="360" w:lineRule="auto"/>
+      </w:pPr>
     </w:p>
     <w:p>
       <w:pPr>
@@ -6544,7 +6549,6 @@
           <w:color w:val="000000"/>
           <w:sz w:val="24"/>
         </w:rPr>
-        <w:lastRenderedPageBreak/>
         <w:t>3. Bài tập thực hành 3B (20 phút): CSS Grid - Gallery Layout</w:t>
       </w:r>
       <w:bookmarkEnd w:id="29"/>
@@ -6918,6 +6922,15 @@
           <w:sz w:val="18"/>
         </w:rPr>
         <w:br/>
+      </w:r>
+      <w:r>
+        <w:rPr>
+          <w:rStyle w:val="VerbatimChar"/>
+          <w:rFonts w:ascii="IBM Plex Mono" w:eastAsia="IBM Plex Mono" w:hAnsi="IBM Plex Mono" w:cs="IBM Plex Mono"/>
+          <w:color w:val="000000"/>
+          <w:sz w:val="18"/>
+        </w:rPr>
+        <w:lastRenderedPageBreak/>
         <w:t xml:space="preserve">       - height: 150px</w:t>
       </w:r>
       <w:r>
@@ -6938,15 +6951,6 @@
           <w:sz w:val="18"/>
         </w:rPr>
         <w:br/>
-      </w:r>
-      <w:r>
-        <w:rPr>
-          <w:rStyle w:val="VerbatimChar"/>
-          <w:rFonts w:ascii="IBM Plex Mono" w:eastAsia="IBM Plex Mono" w:hAnsi="IBM Plex Mono" w:cs="IBM Plex Mono"/>
-          <w:color w:val="000000"/>
-          <w:sz w:val="18"/>
-        </w:rPr>
-        <w:lastRenderedPageBreak/>
         <w:t xml:space="preserve">       - border-radius: 8px</w:t>
       </w:r>
       <w:r>
@@ -7495,8 +7499,8 @@
       </w:tblPr>
       <w:tblGrid>
         <w:gridCol w:w="1191"/>
-        <w:gridCol w:w="900"/>
-        <w:gridCol w:w="1394"/>
+        <w:gridCol w:w="5288"/>
+        <w:gridCol w:w="3025"/>
       </w:tblGrid>
       <w:tr>
         <w:trPr>
@@ -7623,6 +7627,12 @@
                 <w:rFonts w:ascii="Cambria" w:hAnsi="Cambria"/>
               </w:rPr>
             </w:pPr>
+            <w:r>
+              <w:rPr>
+                <w:rFonts w:ascii="Cambria" w:hAnsi="Cambria"/>
+              </w:rPr>
+              <w:t>Giá trị mặc định</w:t>
+            </w:r>
           </w:p>
         </w:tc>
         <w:tc>
@@ -7687,6 +7697,12 @@
                 <w:rFonts w:ascii="Cambria" w:hAnsi="Cambria"/>
               </w:rPr>
             </w:pPr>
+            <w:r>
+              <w:rPr>
+                <w:rFonts w:ascii="Cambria" w:hAnsi="Cambria"/>
+              </w:rPr>
+              <w:t>Định vị tương đối so với vị trí ban đầu</w:t>
+            </w:r>
           </w:p>
         </w:tc>
         <w:tc>
@@ -7704,6 +7720,12 @@
                 <w:rFonts w:ascii="Cambria" w:hAnsi="Cambria"/>
               </w:rPr>
             </w:pPr>
+            <w:r>
+              <w:rPr>
+                <w:rFonts w:ascii="Cambria" w:hAnsi="Cambria"/>
+              </w:rPr>
+              <w:t>Dùng khi làm mốc cho absolute</w:t>
+            </w:r>
           </w:p>
         </w:tc>
       </w:tr>
@@ -7754,6 +7776,12 @@
                 <w:rFonts w:ascii="Cambria" w:hAnsi="Cambria"/>
               </w:rPr>
             </w:pPr>
+            <w:r>
+              <w:rPr>
+                <w:rFonts w:ascii="Cambria" w:hAnsi="Cambria"/>
+              </w:rPr>
+              <w:t xml:space="preserve">Định vị tuyệt đối theo phần tử cha gần nhất </w:t>
+            </w:r>
           </w:p>
         </w:tc>
         <w:tc>
@@ -7771,6 +7799,12 @@
                 <w:rFonts w:ascii="Cambria" w:hAnsi="Cambria"/>
               </w:rPr>
             </w:pPr>
+            <w:r>
+              <w:rPr>
+                <w:rFonts w:ascii="Cambria" w:hAnsi="Cambria"/>
+              </w:rPr>
+              <w:t>Dùng làm icon nằm chồng lên ảnh</w:t>
+            </w:r>
           </w:p>
         </w:tc>
       </w:tr>
@@ -7821,6 +7855,12 @@
                 <w:rFonts w:ascii="Cambria" w:hAnsi="Cambria"/>
               </w:rPr>
             </w:pPr>
+            <w:r>
+              <w:rPr>
+                <w:rFonts w:ascii="Cambria" w:hAnsi="Cambria"/>
+              </w:rPr>
+              <w:t>Cố định theo cửa sổ trình duyệt không di chuyển khi cuộn trang</w:t>
+            </w:r>
           </w:p>
         </w:tc>
         <w:tc>
@@ -7838,6 +7878,12 @@
                 <w:rFonts w:ascii="Cambria" w:hAnsi="Cambria"/>
               </w:rPr>
             </w:pPr>
+            <w:r>
+              <w:rPr>
+                <w:rFonts w:ascii="Cambria" w:hAnsi="Cambria"/>
+              </w:rPr>
+              <w:t>Thanh menu cố định</w:t>
+            </w:r>
           </w:p>
         </w:tc>
       </w:tr>
@@ -7888,6 +7934,12 @@
                 <w:rFonts w:ascii="Cambria" w:hAnsi="Cambria"/>
               </w:rPr>
             </w:pPr>
+            <w:r>
+              <w:rPr>
+                <w:rFonts w:ascii="Cambria" w:hAnsi="Cambria"/>
+              </w:rPr>
+              <w:t>khi cuộn tới vị trí xác định thì sẽ cố định lại</w:t>
+            </w:r>
           </w:p>
         </w:tc>
         <w:tc>
@@ -7905,6 +7957,12 @@
                 <w:rFonts w:ascii="Cambria" w:hAnsi="Cambria"/>
               </w:rPr>
             </w:pPr>
+            <w:r>
+              <w:rPr>
+                <w:rFonts w:ascii="Cambria" w:hAnsi="Cambria"/>
+              </w:rPr>
+              <w:t>Header khi cuộn xuống</w:t>
+            </w:r>
           </w:p>
         </w:tc>
       </w:tr>
@@ -8193,7 +8251,6 @@
           <w:color w:val="000000"/>
           <w:sz w:val="24"/>
         </w:rPr>
-        <w:lastRenderedPageBreak/>
         <w:t>3. Bài tập thực hành 4 (30 phút): Tạo Header Sticky + Responsive</w:t>
       </w:r>
       <w:bookmarkEnd w:id="40"/>
@@ -8561,6 +8618,15 @@
           <w:sz w:val="18"/>
         </w:rPr>
         <w:br/>
+      </w:r>
+      <w:r>
+        <w:rPr>
+          <w:rStyle w:val="VerbatimChar"/>
+          <w:rFonts w:ascii="IBM Plex Mono" w:eastAsia="IBM Plex Mono" w:hAnsi="IBM Plex Mono" w:cs="IBM Plex Mono"/>
+          <w:color w:val="000000"/>
+          <w:sz w:val="18"/>
+        </w:rPr>
+        <w:lastRenderedPageBreak/>
         <w:t xml:space="preserve">       - display: flex, justify/align center</w:t>
       </w:r>
       <w:r>
@@ -8581,15 +8647,6 @@
           <w:sz w:val="18"/>
         </w:rPr>
         <w:br/>
-      </w:r>
-      <w:r>
-        <w:rPr>
-          <w:rStyle w:val="VerbatimChar"/>
-          <w:rFonts w:ascii="IBM Plex Mono" w:eastAsia="IBM Plex Mono" w:hAnsi="IBM Plex Mono" w:cs="IBM Plex Mono"/>
-          <w:color w:val="000000"/>
-          <w:sz w:val="18"/>
-        </w:rPr>
-        <w:lastRenderedPageBreak/>
         <w:t xml:space="preserve">       - font-size: 24px</w:t>
       </w:r>
       <w:r>
@@ -8811,14 +8868,65 @@
     <w:p>
       <w:pPr>
         <w:spacing w:after="210" w:line="360" w:lineRule="auto"/>
-      </w:pPr>
-      <w:r>
         <w:rPr>
           <w:rFonts w:ascii="inter" w:eastAsia="inter" w:hAnsi="inter" w:cs="inter"/>
           <w:i/>
           <w:color w:val="000000"/>
         </w:rPr>
+      </w:pPr>
+      <w:r>
+        <w:rPr>
+          <w:rFonts w:ascii="inter" w:eastAsia="inter" w:hAnsi="inter" w:cs="inter"/>
+          <w:i/>
+          <w:color w:val="000000"/>
+        </w:rPr>
         <w:t>(Dán ảnh: Giao diện có header sticky và nút scroll)</w:t>
+      </w:r>
+    </w:p>
+    <w:p>
+      <w:pPr>
+        <w:spacing w:after="210" w:line="360" w:lineRule="auto"/>
+      </w:pPr>
+      <w:r>
+        <w:rPr>
+          <w:noProof/>
+        </w:rPr>
+        <w:lastRenderedPageBreak/>
+        <w:drawing>
+          <wp:inline distT="0" distB="0" distL="0" distR="0" wp14:anchorId="4EBB5EF8" wp14:editId="6DFBE74B">
+            <wp:extent cx="6038850" cy="3365500"/>
+            <wp:effectExtent l="0" t="0" r="0" b="6350"/>
+            <wp:docPr id="5" name="Picture 5"/>
+            <wp:cNvGraphicFramePr>
+              <a:graphicFrameLocks xmlns:a="http://schemas.openxmlformats.org/drawingml/2006/main" noChangeAspect="1"/>
+            </wp:cNvGraphicFramePr>
+            <a:graphic xmlns:a="http://schemas.openxmlformats.org/drawingml/2006/main">
+              <a:graphicData uri="http://schemas.openxmlformats.org/drawingml/2006/picture">
+                <pic:pic xmlns:pic="http://schemas.openxmlformats.org/drawingml/2006/picture">
+                  <pic:nvPicPr>
+                    <pic:cNvPr id="1" name=""/>
+                    <pic:cNvPicPr/>
+                  </pic:nvPicPr>
+                  <pic:blipFill>
+                    <a:blip r:embed="rId13"/>
+                    <a:stretch>
+                      <a:fillRect/>
+                    </a:stretch>
+                  </pic:blipFill>
+                  <pic:spPr>
+                    <a:xfrm>
+                      <a:off x="0" y="0"/>
+                      <a:ext cx="6038850" cy="3365500"/>
+                    </a:xfrm>
+                    <a:prstGeom prst="rect">
+                      <a:avLst/>
+                    </a:prstGeom>
+                  </pic:spPr>
+                </pic:pic>
+              </a:graphicData>
+            </a:graphic>
+          </wp:inline>
+        </w:drawing>
       </w:r>
     </w:p>
     <w:p>

</xml_diff>